<commit_message>
Update PTC Creo CAD Portfolio.docx
</commit_message>
<xml_diff>
--- a/Computer Aided Design/PTC Creo/PTC Creo CAD Portfolio.docx
+++ b/Computer Aided Design/PTC Creo/PTC Creo CAD Portfolio.docx
@@ -58,16 +58,34 @@
           </w:tcPr>
           <w:p>
             <w:pPr>
+              <w:spacing w:line="204" w:lineRule="auto"/>
               <w:jc w:val="center"/>
               <w:rPr>
-                <w:rFonts w:ascii="Copperplate Gothic Light" w:hAnsi="Copperplate Gothic Light" w:cs="Copperplate Gothic Light"/>
+                <w:rFonts w:ascii="Viner Hand ITC" w:hAnsi="Viner Hand ITC" w:cs="Viner Hand ITC"/>
                 <w:b/>
                 <w:bCs/>
-                <w:color w:val="000000" w:themeColor="text1"/>
-                <w:sz w:val="80"/>
-                <w:szCs w:val="80"/>
+                <w:color w:val="C55E10" w:themeColor="accent2" w:themeShade="BF"/>
+                <w:sz w:val="128"/>
+                <w:szCs w:val="128"/>
+                <w14:shadow w14:blurRad="114300" w14:dist="0" w14:dir="0" w14:sx="0" w14:sy="0" w14:kx="0" w14:ky="0" w14:algn="none">
+                  <w14:srgbClr w14:val="000000"/>
+                </w14:shadow>
               </w:rPr>
             </w:pPr>
+            <w:r>
+              <w:rPr>
+                <w:rFonts w:ascii="Viner Hand ITC" w:hAnsi="Viner Hand ITC" w:cs="Viner Hand ITC"/>
+                <w:b/>
+                <w:bCs/>
+                <w:color w:val="C55E10" w:themeColor="accent2" w:themeShade="BF"/>
+                <w:sz w:val="128"/>
+                <w:szCs w:val="128"/>
+                <w14:shadow w14:blurRad="114300" w14:dist="0" w14:dir="0" w14:sx="0" w14:sy="0" w14:kx="0" w14:ky="0" w14:algn="none">
+                  <w14:srgbClr w14:val="000000"/>
+                </w14:shadow>
+              </w:rPr>
+              <w:t>PTC CREO</w:t>
+            </w:r>
           </w:p>
           <w:p>
             <w:pPr>
@@ -97,7 +115,7 @@
                   <w14:srgbClr w14:val="000000"/>
                 </w14:shadow>
               </w:rPr>
-              <w:t>PTC CREO CAD PORTFOLIO</w:t>
+              <w:t>PORTFOLIO</w:t>
             </w:r>
           </w:p>
           <w:p>

</xml_diff>